<commit_message>
trying to fix merge error
</commit_message>
<xml_diff>
--- a/reports/thesis/06_chapter_2.docx
+++ b/reports/thesis/06_chapter_2.docx
@@ -943,7 +943,7 @@
         <w:t xml:space="preserve"> after leaving the territory. </w:t>
       </w:r>
       <w:r>
-        <w:t xml:space="preserve">We hypothesize that movements decisions will be primarily governed by </w:t>
+        <w:t xml:space="preserve">We hypothesize that movement decisions will be primarily governed by </w:t>
       </w:r>
       <w:r>
         <w:t>carrion</w:t>
@@ -1179,11 +1179,17 @@
         <w:ind w:firstLine="720"/>
       </w:pPr>
       <w:r>
-        <w:t xml:space="preserve">We defined two hunting areas corresponding to the MT Fish, Wildlife, and Parks (MTFWP) rifle hunting season and the tribal bison hunting season. During the MTFWP rifle hunting season, elk and deer are the main targets and are small enough to be packed out by hunters. We delineated this region (hereafter MTFWP hunting region, Fig. 1, Sup. Fig. 1) </w:t>
+        <w:t xml:space="preserve">We defined two hunting areas corresponding to the </w:t>
+      </w:r>
+      <w:r>
+        <w:t>Montana</w:t>
+      </w:r>
+      <w:r>
+        <w:t xml:space="preserve"> Fish, Wildlife, and Parks (MTFWP) rifle hunting season and the tribal bison hunting season. During the MTFWP rifle hunting season, elk and deer are the main targets and are small enough to be packed out by hunters. We delineated this region (hereafter MTFWP hunting region, Fig. 1, Sup. Fig. </w:t>
       </w:r>
       <w:r>
         <w:lastRenderedPageBreak/>
-        <w:t xml:space="preserve">using a 5 km buffer around all roads 10 km away from the park entrance station in Gardiner, MT. </w:t>
+        <w:t xml:space="preserve">1) using a 5 km buffer around all roads 10 km away from the park entrance station in Gardiner, MT. </w:t>
       </w:r>
     </w:p>
     <w:p>
@@ -1198,7 +1204,19 @@
         <w:t>to</w:t>
       </w:r>
       <w:r>
-        <w:t xml:space="preserve"> the open area along the south side of the Yellowstone River at the park boundary. Adult male bison can weigh over 750 kg during the hunting season (Yellowstone Bison Office, National Park Service, unpublished data), so the effort required to hike a bison harvest back to the road is great and is avoided</w:t>
+        <w:t xml:space="preserve"> the open area along the south side of the Yellowstone River at the park boundary. Adult male bison can weigh over 750 kg during the hunting season (Yellowstone Bison Office, National Park Service, unpublished data), so the effort required to </w:t>
+      </w:r>
+      <w:r>
+        <w:t>pack</w:t>
+      </w:r>
+      <w:r>
+        <w:t xml:space="preserve"> a </w:t>
+      </w:r>
+      <w:r>
+        <w:t xml:space="preserve">harvested </w:t>
+      </w:r>
+      <w:r>
+        <w:t>bison back to the road is great and is avoided</w:t>
       </w:r>
       <w:r>
         <w:t xml:space="preserve"> by hunters</w:t>
@@ -1222,7 +1240,13 @@
         <w:t>s</w:t>
       </w:r>
       <w:r>
-        <w:t>, but the vast majority of hunting occurs within this space.</w:t>
+        <w:t xml:space="preserve">, but </w:t>
+      </w:r>
+      <w:r>
+        <w:t>most bison harvest</w:t>
+      </w:r>
+      <w:r>
+        <w:t xml:space="preserve"> occurs within this space.</w:t>
       </w:r>
     </w:p>
     <w:p>
@@ -1863,7 +1887,7 @@
         <w:ind w:firstLine="720"/>
       </w:pPr>
       <w:r>
-        <w:t xml:space="preserve">We restricted both models to data from </w:t>
+        <w:t xml:space="preserve">We restricted both models to </w:t>
       </w:r>
       <w:commentRangeStart w:id="8"/>
       <w:r>
@@ -1891,7 +1915,13 @@
         <w:t>P</w:t>
       </w:r>
       <w:r>
-        <w:t>roject because that is the period the wolf carcass predictive algorithm works for due to a higher wolf collar fix rate. We included two covariates to represent the hunting season and assess to what extent ravens tracked the potential biomass versus a broader seasonally determined availability.</w:t>
+        <w:t>roject because that is the period the wolf carcass predictive algorithm</w:t>
+      </w:r>
+      <w:r>
+        <w:t xml:space="preserve"> is intended for</w:t>
+      </w:r>
+      <w:r>
+        <w:t>. We included two covariates to represent the hunting season and assess to what extent ravens tracked the potential biomass versus a broader seasonally determined availability.</w:t>
       </w:r>
       <w:r>
         <w:t xml:space="preserve"> </w:t>
@@ -1903,11 +1933,11 @@
         <w:t xml:space="preserve"> available</w:t>
       </w:r>
       <w:r>
-        <w:t xml:space="preserve"> to determine if anthropogenic resources were prioritized in the decision-making process. Other covariates </w:t>
+        <w:t xml:space="preserve"> to determine if anthropogenic resources were prioritized in the decision-making process. Other covariates in the territory model include </w:t>
       </w:r>
       <w:r>
         <w:lastRenderedPageBreak/>
-        <w:t>in the territory model include the distance to the hunting regions, average wolf kill density within the territory, pre-breeding season period, the proportion of other ravens leaving their territories, daily maximum temperature, and daily snow depth. Other covariates in the hunting model are the distance to the hunting region, the proportion of other ravens visiting the hunting regions, average daily temperature, and daily snow depth.</w:t>
+        <w:t>the distance to the hunting regions, average wolf kill density within the territory, pre-breeding season period, the proportion of other ravens leaving their territories, daily maximum temperature, and daily snow depth. Other covariates in the hunting model are the distance to the hunting region, the proportion of other ravens visiting the hunting regions, average daily temperature, and daily snow depth.</w:t>
       </w:r>
     </w:p>
     <w:p>
@@ -4055,10 +4085,7 @@
         <w:t>ravens</w:t>
       </w:r>
       <w:r>
-        <w:t xml:space="preserve"> tend to search for resources outside of their territories, even when foraging opportunities are present locally.</w:t>
-      </w:r>
-      <w:r>
-        <w:t xml:space="preserve"> </w:t>
+        <w:t xml:space="preserve"> tend to search for resources outside of their territories, even when foraging opportunities are present locally. </w:t>
       </w:r>
     </w:p>
     <w:p>

</xml_diff>

<commit_message>
added odd ratios to results, updated maps
</commit_message>
<xml_diff>
--- a/reports/thesis/06_chapter_2.docx
+++ b/reports/thesis/06_chapter_2.docx
@@ -1564,7 +1564,13 @@
         <w:commentReference w:id="5"/>
       </w:r>
       <w:r>
-        <w:t xml:space="preserve">after the last wolf GPS point. This additional day accounts for the continued availability and use of the carcass after wolves have abandoned it. For resources within a raven’s territory (Fig. 1), we considered all wolf-killed carcasses within 1 kilometer of a territory to be immediately known by the local raven. For resources located after leaving the territory, we considered a raven to have visited a wolf kill if there was at least 1 GPS point within 500 meters of an active kill site. We removed wolf-kills sites identified by the predictive model that were within the appropriate hunting region for the date because the raven had already arrived to forage for hunter-killed carrion. </w:t>
+        <w:t>after the last wolf GPS point. This additional day accounts for the continued availability and use of the carcass after wolves have abandoned it. For resources within a raven’s territory (Fig. 1), we considered all wolf-killed carcasses within 1 kilometer of a territory to be immediately known by the local raven. For resources located after leaving the territory, we considered a raven to have visited a wolf kill if there was at least 1 GPS point within 500</w:t>
+      </w:r>
+      <w:r>
+        <w:t>-</w:t>
+      </w:r>
+      <w:r>
+        <w:t xml:space="preserve">meters of an active kill site. We removed wolf-kill sites identified by the predictive model that were within the appropriate hunting region for the date because the raven had already arrived to forage for hunter-killed carrion. </w:t>
       </w:r>
     </w:p>
     <w:p>
@@ -1918,14 +1924,14 @@
         <w:t xml:space="preserve"> considered a model that</w:t>
       </w:r>
       <w:r>
-        <w:t xml:space="preserve"> assumed limited knowledge of kill availability within their territory, applying the same 500-meter visit criterion to within-territory kills as was used for kills outside the territory.</w:t>
-      </w:r>
-    </w:p>
-    <w:p>
-      <w:pPr>
-        <w:spacing w:line="480" w:lineRule="auto"/>
-        <w:ind w:firstLine="720"/>
-      </w:pPr>
+        <w:t xml:space="preserve"> assumed limited knowledge of kill availability within their territory</w:t>
+      </w:r>
+      <w:r>
+        <w:t xml:space="preserve"> by</w:t>
+      </w:r>
+      <w:r>
+        <w:t xml:space="preserve"> applying the same 500-meter visit criterion to within-territory kills as was used for kills outside the territory.</w:t>
+      </w:r>
     </w:p>
     <w:p>
       <w:pPr>
@@ -2552,6 +2558,16 @@
         <w:spacing w:line="480" w:lineRule="auto"/>
         <w:ind w:firstLine="720"/>
         <w:jc w:val="center"/>
+        <w:rPr>
+          <w:noProof/>
+        </w:rPr>
+      </w:pPr>
+    </w:p>
+    <w:p>
+      <w:pPr>
+        <w:spacing w:line="480" w:lineRule="auto"/>
+        <w:ind w:firstLine="720"/>
+        <w:jc w:val="center"/>
       </w:pPr>
       <w:r>
         <w:rPr>
@@ -2559,10 +2575,10 @@
         </w:rPr>
         <w:lastRenderedPageBreak/>
         <w:drawing>
-          <wp:inline distT="0" distB="0" distL="0" distR="0" wp14:anchorId="64C39413" wp14:editId="3FE42D02">
-            <wp:extent cx="5649141" cy="4185138"/>
-            <wp:effectExtent l="0" t="0" r="8890" b="6350"/>
-            <wp:docPr id="2035111259" name="Picture 1"/>
+          <wp:inline distT="0" distB="0" distL="0" distR="0" wp14:anchorId="7F90E314" wp14:editId="08A90992">
+            <wp:extent cx="5736031" cy="4238625"/>
+            <wp:effectExtent l="0" t="0" r="0" b="0"/>
+            <wp:docPr id="92184951" name="Picture 2"/>
             <wp:cNvGraphicFramePr>
               <a:graphicFrameLocks xmlns:a="http://schemas.openxmlformats.org/drawingml/2006/main" noChangeAspect="1"/>
             </wp:cNvGraphicFramePr>
@@ -2570,7 +2586,7 @@
               <a:graphicData uri="http://schemas.openxmlformats.org/drawingml/2006/picture">
                 <pic:pic xmlns:pic="http://schemas.openxmlformats.org/drawingml/2006/picture">
                   <pic:nvPicPr>
-                    <pic:cNvPr id="0" name="Picture 1"/>
+                    <pic:cNvPr id="0" name="Picture 2"/>
                     <pic:cNvPicPr>
                       <a:picLocks noChangeAspect="1" noChangeArrowheads="1"/>
                     </pic:cNvPicPr>
@@ -2583,7 +2599,7 @@
                         </a:ext>
                       </a:extLst>
                     </a:blip>
-                    <a:srcRect l="12621" r="11444"/>
+                    <a:srcRect l="12681" r="11075"/>
                     <a:stretch>
                       <a:fillRect/>
                     </a:stretch>
@@ -2591,7 +2607,7 @@
                   <pic:spPr bwMode="auto">
                     <a:xfrm>
                       <a:off x="0" y="0"/>
-                      <a:ext cx="5659090" cy="4192509"/>
+                      <a:ext cx="5738261" cy="4240273"/>
                     </a:xfrm>
                     <a:prstGeom prst="rect">
                       <a:avLst/>
@@ -2641,6 +2657,30 @@
       <w:r>
         <w:t xml:space="preserve">ungulate hunting does and does not occur. </w:t>
       </w:r>
+      <w:r>
+        <w:t>The entire mapping period is between September 1 and March 3</w:t>
+      </w:r>
+      <w:r>
+        <w:t>1</w:t>
+      </w:r>
+      <w:r>
+        <w:t xml:space="preserve"> with each individual map based around the timing of the various hunting seasons. </w:t>
+      </w:r>
+      <w:r>
+        <w:t>The models use a subset of this data from Nov 15</w:t>
+      </w:r>
+      <w:r>
+        <w:t xml:space="preserve"> </w:t>
+      </w:r>
+      <w:r>
+        <w:t xml:space="preserve">- Dec 15 and Mar 1 </w:t>
+      </w:r>
+      <w:r>
+        <w:t>-</w:t>
+      </w:r>
+      <w:r>
+        <w:t xml:space="preserve"> Mar 30. </w:t>
+      </w:r>
     </w:p>
     <w:p>
       <w:pPr>
@@ -2735,7 +2775,11 @@
         <w:t xml:space="preserve"> by individual</w:t>
       </w:r>
       <w:r>
-        <w:t xml:space="preserve"> territorial ravens, either within their territory or beyond it. Raven territories were 0.8 – 21.2 km</w:t>
+        <w:t xml:space="preserve"> </w:t>
+      </w:r>
+      <w:r>
+        <w:lastRenderedPageBreak/>
+        <w:t>territorial ravens, either within their territory or beyond it. Raven territories were 0.8 – 21.2 km</w:t>
       </w:r>
       <w:r>
         <w:rPr>
@@ -2798,17 +2842,50 @@
         <w:t>7</w:t>
       </w:r>
       <w:r>
-        <w:t xml:space="preserve">%). Wolf kills were only </w:t>
+        <w:t xml:space="preserve">%). </w:t>
+      </w:r>
+      <w:r>
+        <w:t>We recorded ravens going within 500</w:t>
+      </w:r>
+      <w:r>
+        <w:t xml:space="preserve">-meters </w:t>
+      </w:r>
+      <w:r>
+        <w:t>of wolf kills on their territories 26.5% of days we defined as having an available wolf kill (53.1% for within 1000</w:t>
+      </w:r>
+      <w:r>
+        <w:t xml:space="preserve"> </w:t>
+      </w:r>
+      <w:r>
+        <w:t xml:space="preserve">m) </w:t>
+      </w:r>
+      <w:commentRangeStart w:id="18"/>
+      <w:r>
+        <w:t>and ravens visited a particular wolf kill on at least one day during its available duration 32% of the time</w:t>
+      </w:r>
+      <w:commentRangeEnd w:id="18"/>
+      <w:r>
+        <w:rPr>
+          <w:rStyle w:val="CommentReference"/>
+          <w:sz w:val="24"/>
+          <w:szCs w:val="24"/>
+        </w:rPr>
+        <w:commentReference w:id="18"/>
+      </w:r>
+      <w:r>
+        <w:t>.</w:t>
+      </w:r>
+      <w:r>
+        <w:t xml:space="preserve"> </w:t>
+      </w:r>
+      <w:r>
+        <w:t xml:space="preserve">Wolf kills were only </w:t>
       </w:r>
       <w:r>
         <w:t>visited</w:t>
       </w:r>
       <w:r>
-        <w:t xml:space="preserve"> </w:t>
-      </w:r>
-      <w:r>
-        <w:lastRenderedPageBreak/>
-        <w:t xml:space="preserve">outside of the territory on a mean of </w:t>
+        <w:t xml:space="preserve"> outside of the territory on a mean of </w:t>
       </w:r>
       <w:r>
         <w:t>2.</w:t>
@@ -2959,18 +3036,19 @@
       <w:pPr>
         <w:spacing w:line="480" w:lineRule="auto"/>
       </w:pPr>
-      <w:commentRangeStart w:id="18"/>
-      <w:r>
+      <w:commentRangeStart w:id="19"/>
+      <w:r>
+        <w:lastRenderedPageBreak/>
         <w:t>Figu</w:t>
       </w:r>
-      <w:commentRangeEnd w:id="18"/>
+      <w:commentRangeEnd w:id="19"/>
       <w:r>
         <w:rPr>
           <w:rStyle w:val="CommentReference"/>
           <w:sz w:val="24"/>
           <w:szCs w:val="24"/>
         </w:rPr>
-        <w:commentReference w:id="18"/>
+        <w:commentReference w:id="19"/>
       </w:r>
       <w:r>
         <w:t xml:space="preserve">re 2. The proportion of decision days </w:t>
@@ -2994,11 +3072,7 @@
         <w:t>unting” category is used to show a raven visited the Gardiner hunting regions to forage for hunter-created carrion. Instances where a wolf kill was active in their territory (stripes) or visited outside their territory (dots) are denoted by the pattern</w:t>
       </w:r>
       <w:r>
-        <w:t xml:space="preserve"> in the </w:t>
-      </w:r>
-      <w:r>
-        <w:lastRenderedPageBreak/>
-        <w:t>appropriate category for the final decision made that day</w:t>
+        <w:t xml:space="preserve"> in the appropriate category for the final decision made that day</w:t>
       </w:r>
       <w:r>
         <w:t xml:space="preserve">. The total number of decision days for each raven is displayed on the right-hand side of the plot. </w:t>
@@ -3101,7 +3175,22 @@
         <w:t xml:space="preserve">, Table 1, Fig. 4, 5). </w:t>
       </w:r>
       <w:r>
-        <w:t xml:space="preserve">Considering a more conservation assumption of a raven’s knowledge of wolf kills within its territory increased the negative impact of wolf kills to 11.6 </w:t>
+        <w:t>A</w:t>
+      </w:r>
+      <w:r>
+        <w:t xml:space="preserve"> more conservation assumption of a raven’s knowledge of wolf kills within its territory increased the </w:t>
+      </w:r>
+      <w:r>
+        <w:t>effect</w:t>
+      </w:r>
+      <w:r>
+        <w:t xml:space="preserve"> of wolf kills to </w:t>
+      </w:r>
+      <w:r>
+        <w:t xml:space="preserve">a </w:t>
+      </w:r>
+      <w:r>
+        <w:t xml:space="preserve">11.6 </w:t>
       </w:r>
       <w:r>
         <w:t>–</w:t>
@@ -3113,13 +3202,46 @@
         <w:t>22.9</w:t>
       </w:r>
       <w:r>
-        <w:t xml:space="preserve">%. However, the </w:t>
+        <w:t>%</w:t>
+      </w:r>
+      <w:r>
+        <w:t xml:space="preserve"> decrease in the probability of leaving</w:t>
+      </w:r>
+      <w:r>
+        <w:t xml:space="preserve"> </w:t>
+      </w:r>
+      <w:r>
+        <w:t>(-</w:t>
+      </w:r>
+      <w:r>
+        <w:t>1.7</w:t>
+      </w:r>
+      <w:r>
+        <w:t>, SE = 0.</w:t>
+      </w:r>
+      <w:r>
+        <w:t>76</w:t>
+      </w:r>
+      <w:r>
+        <w:t xml:space="preserve">, p </w:t>
+      </w:r>
+      <w:r>
+        <w:t>&lt; 0.05)</w:t>
+      </w:r>
+      <w:r>
+        <w:t xml:space="preserve">. However, the </w:t>
       </w:r>
       <w:r>
         <w:t>probability</w:t>
       </w:r>
       <w:r>
-        <w:t xml:space="preserve"> to leave the territory remain high at </w:t>
+        <w:t xml:space="preserve"> to leave the territory remain</w:t>
+      </w:r>
+      <w:r>
+        <w:t>ed</w:t>
+      </w:r>
+      <w:r>
+        <w:t xml:space="preserve"> high at </w:t>
       </w:r>
       <w:r>
         <w:t>69.8</w:t>
@@ -3128,7 +3250,7 @@
         <w:t xml:space="preserve"> – 85.4%. </w:t>
       </w:r>
       <w:r>
-        <w:t>The availability of hunter-created carrion did not impact a raven’s decision to leave its territory, regardless of the metric of consideration (hunting biomass: -0.0</w:t>
+        <w:t>The availability of hunter-created carrion did not impact a raven’s decision to leave its territory, regardless of the metric of consideration (biomass: -0.0</w:t>
       </w:r>
       <w:r>
         <w:t>0</w:t>
@@ -3152,7 +3274,7 @@
         <w:t>4</w:t>
       </w:r>
       <w:r>
-        <w:t>; hunting season: -0.</w:t>
+        <w:t>; season: -0.</w:t>
       </w:r>
       <w:r>
         <w:t>1</w:t>
@@ -3182,68 +3304,87 @@
         <w:t xml:space="preserve">; </w:t>
       </w:r>
       <w:r>
-        <w:t>Table 1, Fig. 4). Ravens were less likely to leave their territory during March compared to November and December (-0.</w:t>
-      </w:r>
-      <w:r>
-        <w:t>77</w:t>
+        <w:t xml:space="preserve">Table 1, Fig. 4). Ravens were </w:t>
+      </w:r>
+      <w:r>
+        <w:t>53.8</w:t>
+      </w:r>
+      <w:r>
+        <w:t>% (</w:t>
+      </w:r>
+      <w:r>
+        <w:t>18.3</w:t>
+      </w:r>
+      <w:r>
+        <w:t xml:space="preserve">, </w:t>
+      </w:r>
+      <w:r>
+        <w:t>73.9</w:t>
+      </w:r>
+      <w:r>
+        <w:t>)</w:t>
+      </w:r>
+      <w:r>
+        <w:t xml:space="preserve"> </w:t>
+      </w:r>
+      <w:r>
+        <w:t xml:space="preserve">less </w:t>
+      </w:r>
+      <w:r>
+        <w:t xml:space="preserve">likely </w:t>
+      </w:r>
+      <w:r>
+        <w:lastRenderedPageBreak/>
+        <w:t>to leave their territory during March compared to November and December</w:t>
+      </w:r>
+      <w:r>
+        <w:t xml:space="preserve">. </w:t>
+      </w:r>
+      <w:r>
+        <w:t xml:space="preserve">There was evidence that </w:t>
+      </w:r>
+      <w:r>
+        <w:t xml:space="preserve">This effect showed evidence for an interaction with snow depth where snow depth </w:t>
+      </w:r>
+      <w:r>
+        <w:t xml:space="preserve">had a stronger impact in late winter with less snow leading to lower probabilities of </w:t>
+      </w:r>
+      <w:r>
+        <w:t>traveling beyond the</w:t>
+      </w:r>
+      <w:r>
+        <w:t xml:space="preserve"> territory</w:t>
+      </w:r>
+      <w:r>
+        <w:t xml:space="preserve"> </w:t>
+      </w:r>
+      <w:r>
+        <w:t>(</w:t>
+      </w:r>
+      <w:r>
+        <w:t>-0.5</w:t>
+      </w:r>
+      <w:r>
+        <w:t>5</w:t>
       </w:r>
       <w:r>
         <w:t>, SE = 0.</w:t>
       </w:r>
       <w:r>
-        <w:t>29</w:t>
-      </w:r>
-      <w:r>
-        <w:t>, p &lt; 0.0</w:t>
-      </w:r>
-      <w:r>
-        <w:t>1</w:t>
+        <w:t>32</w:t>
+      </w:r>
+      <w:r>
+        <w:t>, p = 0.</w:t>
+      </w:r>
+      <w:r>
+        <w:t>0</w:t>
+      </w:r>
+      <w:r>
+        <w:t>9</w:t>
       </w:r>
       <w:r>
         <w:t xml:space="preserve">, Table 1). </w:t>
       </w:r>
-      <w:r>
-        <w:t xml:space="preserve">This effect showed evidence for an interaction with snow depth where snow depth </w:t>
-      </w:r>
-      <w:r>
-        <w:t xml:space="preserve">had a stronger impact in late winter with less snow leading to lower probabilities of </w:t>
-      </w:r>
-      <w:r>
-        <w:t>traveling beyond the</w:t>
-      </w:r>
-      <w:r>
-        <w:t xml:space="preserve"> territory</w:t>
-      </w:r>
-      <w:r>
-        <w:t xml:space="preserve"> </w:t>
-      </w:r>
-      <w:r>
-        <w:t>(</w:t>
-      </w:r>
-      <w:r>
-        <w:t>-0.5</w:t>
-      </w:r>
-      <w:r>
-        <w:t>5</w:t>
-      </w:r>
-      <w:r>
-        <w:t>, SE = 0.</w:t>
-      </w:r>
-      <w:r>
-        <w:t>32</w:t>
-      </w:r>
-      <w:r>
-        <w:t>, p = 0.</w:t>
-      </w:r>
-      <w:r>
-        <w:t>0</w:t>
-      </w:r>
-      <w:r>
-        <w:t>9</w:t>
-      </w:r>
-      <w:r>
-        <w:t xml:space="preserve">, Table 1). </w:t>
-      </w:r>
     </w:p>
     <w:p>
       <w:pPr>
@@ -3253,7 +3394,6 @@
         <w:rPr>
           <w:noProof/>
         </w:rPr>
-        <w:lastRenderedPageBreak/>
         <w:drawing>
           <wp:inline distT="0" distB="0" distL="0" distR="0" wp14:anchorId="588FF74B" wp14:editId="542EC119">
             <wp:extent cx="5943600" cy="4292600"/>
@@ -3431,18 +3571,18 @@
       <w:r>
         <w:t xml:space="preserve">When a raven left its territory, its destination was influenced by many factors. Ravens were more likely to visit the hunting regions during the </w:t>
       </w:r>
-      <w:commentRangeStart w:id="19"/>
+      <w:commentRangeStart w:id="20"/>
       <w:r>
         <w:t xml:space="preserve">hunting season </w:t>
       </w:r>
-      <w:commentRangeEnd w:id="19"/>
+      <w:commentRangeEnd w:id="20"/>
       <w:r>
         <w:rPr>
           <w:rStyle w:val="CommentReference"/>
           <w:sz w:val="24"/>
           <w:szCs w:val="24"/>
         </w:rPr>
-        <w:commentReference w:id="19"/>
+        <w:commentReference w:id="20"/>
       </w:r>
       <w:r>
         <w:t>(0.</w:t>
@@ -3971,18 +4111,18 @@
       <w:r>
         <w:t xml:space="preserve"> when </w:t>
       </w:r>
-      <w:commentRangeStart w:id="20"/>
+      <w:commentRangeStart w:id="21"/>
       <w:r>
         <w:t>recreational hunting effort</w:t>
       </w:r>
-      <w:commentRangeEnd w:id="20"/>
+      <w:commentRangeEnd w:id="21"/>
       <w:r>
         <w:rPr>
           <w:rStyle w:val="CommentReference"/>
           <w:sz w:val="24"/>
           <w:szCs w:val="24"/>
         </w:rPr>
-        <w:commentReference w:id="20"/>
+        <w:commentReference w:id="21"/>
       </w:r>
       <w:r>
         <w:t>s</w:t>
@@ -4086,18 +4226,18 @@
       <w:r>
         <w:t>The presence of a wolf kill within a raven’s territory or the discovery of a wolf kill outside of their territory decreased the probability of continuing next resource. W</w:t>
       </w:r>
-      <w:commentRangeStart w:id="21"/>
+      <w:commentRangeStart w:id="22"/>
       <w:r>
         <w:t xml:space="preserve">e were surprised </w:t>
       </w:r>
-      <w:commentRangeEnd w:id="21"/>
+      <w:commentRangeEnd w:id="22"/>
       <w:r>
         <w:rPr>
           <w:rStyle w:val="CommentReference"/>
           <w:sz w:val="24"/>
           <w:szCs w:val="24"/>
         </w:rPr>
-        <w:commentReference w:id="21"/>
+        <w:commentReference w:id="22"/>
       </w:r>
       <w:r>
         <w:t xml:space="preserve">to observe large </w:t>
@@ -4243,7 +4383,7 @@
       <w:r>
         <w:t>Optimal foraging theory would then suggest that ravens should prefer to f</w:t>
       </w:r>
-      <w:commentRangeStart w:id="22"/>
+      <w:commentRangeStart w:id="23"/>
       <w:r>
         <w:t>orag</w:t>
       </w:r>
@@ -4253,14 +4393,14 @@
       <w:r>
         <w:t xml:space="preserve"> </w:t>
       </w:r>
-      <w:commentRangeEnd w:id="22"/>
+      <w:commentRangeEnd w:id="23"/>
       <w:r>
         <w:rPr>
           <w:rStyle w:val="CommentReference"/>
           <w:sz w:val="24"/>
           <w:szCs w:val="24"/>
         </w:rPr>
-        <w:commentReference w:id="22"/>
+        <w:commentReference w:id="23"/>
       </w:r>
       <w:r>
         <w:t>outside of their territory as they are</w:t>
@@ -4316,263 +4456,256 @@
       <w:r>
         <w:t xml:space="preserve"> regardless of wolf kill </w:t>
       </w:r>
-      <w:commentRangeStart w:id="23"/>
       <w:r>
         <w:t>availability</w:t>
       </w:r>
-      <w:commentRangeEnd w:id="23"/>
+      <w:r>
+        <w:t xml:space="preserve"> and the knowledge of </w:t>
+      </w:r>
+      <w:r>
+        <w:t>availability</w:t>
+      </w:r>
+      <w:r>
+        <w:t xml:space="preserve">, </w:t>
+      </w:r>
+      <w:r>
+        <w:t xml:space="preserve">we conclude that </w:t>
+      </w:r>
+      <w:r>
+        <w:t xml:space="preserve">ravens are preferentially choosing to visit anthropogenic resources such as recreational hunting areas. Subsequently, ravens leaving their territory are unlikely to be searching for wolf kills. </w:t>
+      </w:r>
+      <w:r>
+        <w:t>The presence of a newly located resource</w:t>
+      </w:r>
+      <w:r>
+        <w:t xml:space="preserve"> </w:t>
+      </w:r>
+      <w:r>
+        <w:t xml:space="preserve">during travel, such as a wolf kill, likely alters their plan but was not the intended destination. Previous studies mapping movements from </w:t>
+      </w:r>
+      <w:r>
+        <w:t xml:space="preserve">territorial </w:t>
+      </w:r>
+      <w:r>
+        <w:t xml:space="preserve">individuals in our study population showed direct commute paths with few deviation to pass through other areas in the northern range where wolf kills might be located </w:t>
+      </w:r>
+      <w:r>
+        <w:fldChar w:fldCharType="begin"/>
+      </w:r>
+      <w:r>
+        <w:instrText xml:space="preserve"> ADDIN ZOTERO_ITEM CSL_CITATION {"citationID":"O1r6Bykg","properties":{"unsorted":false,"formattedCitation":"(Marzluff et al. 2021)","plainCitation":"(Marzluff et al. 2021)","noteIndex":0},"citationItems":[{"id":972,"uris":["http://zotero.org/users/9968163/items/W246K25Z"],"itemData":{"id":972,"type":"article-journal","abstract":"Common ravens (Corvus corax; ravens) are generalist predators that pose a threat to several rare wildlife species in the western United States. Recent increases in raven populations, which are fueled by increased human subsidies—notably food, water, and nest sites—are concerning to those seeking to conserve rare species. Due to the challenges and inefficiencies of reducing or eliminating subsidies, managers increasingly rely on lethal removal of ravens. Over 125,000 ravens were killed by the U.S. Government from 1996 to 2019, and annual removals have increased 4-fold from the 1990s to mid-2010s. We contend that lethal removal of ravens, while capable of improving the reproduction of rare species, is at best a short-term and ethically untenable solution to a problem that will continue to grow until subsidies are meaningfully reduced or made inaccessible to ravens. In part because of ravens’ abilities to track natural and anthropogenic resources across unfamiliar and expansive areas, the removal of subsidies can lead to sustained shifts in raven abundance, which can have longlasting benefits for sensitive species. In the Greater Yellowstone Ecosystem, USA, for example, we documented extensive use of human subsidies during fall/winter, daily 1-way commutes regularly in excess of 50 km by territorial birds to such subsidies, and dispersals of &gt;700 km by nonbreeders that exploited food and roost subsidies. We call for managers to embrace new approaches to subsidy reduction including: increased involvement of conservation social scientists; increased enforcement of local, state, and federal laws; and increased deployment of a diversity of new technologies to haze and aversively condition ravens. Tackling the hard job of reducing subsidies over the expansive area exploited by ravens is right because it will increase the integrity, stability, and beauty of western ecosystems.","container-title":"Human-Wildlife Interaction","issue":"3","language":"en","page":"516-533","source":"Zotero","title":"Thinking Like a Raven: Restoring Integrity, Stability, and Beauty to Western Ecosystems","volume":"15","author":[{"family":"Marzluff","given":"John M"},{"family":"Loretto","given":"Matthias-Claudio"},{"family":"Ho","given":"Cameron K."},{"family":"Coleman","given":"Georgia W."},{"family":"Restani","given":"Marco"}],"issued":{"date-parts":[["2021"]]}}}],"schema":"https://github.com/citation-style-language/schema/raw/master/csl-citation.json"} </w:instrText>
+      </w:r>
+      <w:r>
+        <w:fldChar w:fldCharType="separate"/>
+      </w:r>
+      <w:r>
+        <w:rPr>
+          <w:rFonts w:ascii="Aptos" w:hAnsi="Aptos"/>
+        </w:rPr>
+        <w:t>(Marzluff et al. 2021)</w:t>
+      </w:r>
+      <w:r>
+        <w:fldChar w:fldCharType="end"/>
+      </w:r>
+      <w:r>
+        <w:t>. This sort of route planning between distant, known resources is</w:t>
+      </w:r>
+      <w:r>
+        <w:t xml:space="preserve"> used by baboons and elephants  </w:t>
+      </w:r>
+      <w:r>
+        <w:fldChar w:fldCharType="begin"/>
+      </w:r>
+      <w:r>
+        <w:instrText xml:space="preserve"> ADDIN ZOTERO_ITEM CSL_CITATION {"citationID":"dBWIEYH7","properties":{"formattedCitation":"(Noser and Byrne 2007, Polansky et al. 2015)","plainCitation":"(Noser and Byrne 2007, Polansky et al. 2015)","noteIndex":0},"citationItems":[{"id":1145,"uris":["http://zotero.org/users/9968163/items/JRVDYD5R"],"itemData":{"id":1145,"type":"article-journal","abstract":"The ability of animals to plan their foraging journeys and to approach resources in a goal-directed way may play a key role in cognitive evolution. Furthermore, optimal foraging theory assumes that animals are adapted to take least-effort routes between resources. Empirical evidence for these beliefs is largely lacking, however. We followed a group of chacma baboons over full days during a 16-month field study. We used GPS to investigate route linearity, travel speed and inter-resource distances, and the degree to which movement was guided by direct visual stimuli from the resources. During the dry season the study group travelled rapidly to sparse fruit sources and waterholes along linear paths over large distances. Inter-resource distances were larger than distances from which the resources could be seen. Seed resources, although situated closer to the sleeping site than fruit sources, were bypassed in the mornings and consumed predominantly in the afternoons, when movements were less linear, slower and shorter. During the rainy season, the animals left their sleeping sites earlier when visiting restricted and patchily distributed fig trees than when visiting abundant and evenly distributed fruit resources. However, travel speed and route linearity were not always associated with goal directedness, because the baboons approached the single sleeping site, presumably a vital resource, slowly and indirectly. Our results suggest that baboons plan their journeys, actively choosing between several out-of-sight resources and approaching them in an efficient, goal-directed way, characteristics commonly used as diagnostic for the presence of a cognitive map and episodic memory.","container-title":"Animal Behaviour","DOI":"10.1016/j.anbehav.2006.04.012","ISSN":"0003-3472","issue":"2","journalAbbreviation":"Animal Behaviour","page":"257-266","source":"ScienceDirect","title":"Travel routes and planning of visits to out-of-sight resources in wild chacma baboons, &lt;i&gt;Papio ursinus&lt;/i&gt;","volume":"73","author":[{"family":"Noser","given":"Rahel"},{"family":"Byrne","given":"Richard W."}],"issued":{"date-parts":[["2007",2,1]]}}},{"id":1147,"uris":["http://zotero.org/users/9968163/items/DGHD5DI8"],"itemData":{"id":1147,"type":"article-journal","abstract":"Spatial memory facilitates resource acquisition where resources are patchy, but how it influences movement behaviour of wide-ranging species remains to be resolved. We examined African elephant spatial memory reflected in movement decisions regarding access to perennial waterholes. State–space models of movement data revealed a rapid, highly directional movement behaviour almost exclusively associated with visiting perennial water. Behavioural change point (BCP) analyses demonstrated that these goal-oriented movements were initiated on average 4.59 km, and up to 49.97 km, from the visited waterhole, with the closest waterhole accessed 90% of the time. Distances of decision points increased when switching to different waterholes, during the dry season, or for female groups relative to males, while selection of the closest waterhole decreased when switching. Overall, our analyses indicated detailed spatial knowledge over large scales, enabling elephants to minimize travel distance through highly directional movement when accessing water. We discuss the likely cognitive and socioecological mechanisms driving these spatially precise movements that are most consistent with our findings. By applying modern analytic techniques to high-resolution movement data, this study illustrates emerging approaches for studying how cognition structures animal movement behaviour in different ecological and social contexts.","container-title":"Proceedings of the Royal Society B: Biological Sciences","DOI":"10.1098/rspb.2014.3042","ISSN":"0962-8452","issue":"1805","journalAbbreviation":"Proc Biol Sci","page":"20143042","source":"Silverchair","title":"Elucidating the significance of spatial memory on movement decisions by African savannah elephants using state–space models","volume":"282","author":[{"family":"Polansky","given":"Leo"},{"family":"Kilian","given":"Werner"},{"family":"Wittemyer","given":"George"}],"issued":{"date-parts":[["2015",4,22]]}}}],"schema":"https://github.com/citation-style-language/schema/raw/master/csl-citation.json"} </w:instrText>
+      </w:r>
+      <w:r>
+        <w:fldChar w:fldCharType="separate"/>
+      </w:r>
+      <w:r>
+        <w:t>(Noser and Byrne 2007, Polansky et al. 2015)</w:t>
+      </w:r>
+      <w:r>
+        <w:fldChar w:fldCharType="end"/>
+      </w:r>
+      <w:r>
+        <w:t xml:space="preserve"> and is</w:t>
+      </w:r>
+      <w:r>
+        <w:t xml:space="preserve"> likely performed by ravens </w:t>
+      </w:r>
+      <w:r>
+        <w:fldChar w:fldCharType="begin"/>
+      </w:r>
+      <w:r>
+        <w:instrText xml:space="preserve"> ADDIN ZOTERO_ITEM CSL_CITATION {"citationID":"r9fRoC6R","properties":{"unsorted":false,"formattedCitation":"(Loretto et al. 2026)","plainCitation":"(Loretto et al. 2026)","noteIndex":0},"citationItems":[{"id":1582,"uris":["http://zotero.org/users/9968163/items/BAM3LF88"],"itemData":{"id":1582,"type":"article-journal","abstract":"Scavengers generally rely on patchily distributed, unpredictable carrion. A long-standing hypothesis suggests scavenging ravens reliably locate such food by directly following large carnivores to their kills. However, by satellite tracking 69 ravens, 20 wolves, and 11 cougars in Yellowstone National Park, we found that following of predators over large distances rarely occurred. Instead, ravens routinely revisited sites where wolf kills were common—returning from distances of up to 155 kilometers to find carrion. Much like navigating to permanent anthropogenic subsidies, ravens appear to remember potential sources of carrion shaped by previous encounters with wolves or their kills. These findings suggest that spatial memory and navigation play a considerably greater role than previously assumed among scavengers, and possibly other wide-ranging species, in search of ephemeral resources.","container-title":"Science","DOI":"10.1126/science.adz9467","issue":"6790","page":"1151-1154","publisher":"American Association for the Advancement of Science","source":"science.org (Atypon)","title":"Ravens anticipate wolf kill sites across broad scales","volume":"391","author":[{"family":"Loretto","given":"Matthias-Claudio"},{"family":"Beck","given":"Kristina B."},{"family":"Smith","given":"Douglas W."},{"family":"Stahler","given":"Daniel R."},{"family":"Walker","given":"Lauren E."},{"family":"Wikelski","given":"Martin"},{"family":"Mueller","given":"Thomas"},{"family":"Safi","given":"Kamran"},{"family":"Marzluff","given":"John M."}],"issued":{"date-parts":[["2026",3,12]]}}}],"schema":"https://github.com/citation-style-language/schema/raw/master/csl-citation.json"} </w:instrText>
+      </w:r>
+      <w:r>
+        <w:fldChar w:fldCharType="separate"/>
+      </w:r>
+      <w:r>
+        <w:rPr>
+          <w:rFonts w:ascii="Aptos" w:hAnsi="Aptos"/>
+        </w:rPr>
+        <w:t>(Loretto et al. 2026)</w:t>
+      </w:r>
+      <w:r>
+        <w:fldChar w:fldCharType="end"/>
+      </w:r>
+      <w:r>
+        <w:t>. Route planning to known resources allows overall energetic costs to be predictable</w:t>
+      </w:r>
+      <w:r>
+        <w:t xml:space="preserve">. </w:t>
+      </w:r>
+    </w:p>
+    <w:p>
+      <w:pPr>
+        <w:spacing w:line="480" w:lineRule="auto"/>
+        <w:ind w:firstLine="720"/>
+      </w:pPr>
+      <w:r>
+        <w:t>After leaving their territories, ravens were more likely to visit the hunting regions during the hunting season, regardless of the amount of biomass created by hunters.</w:t>
+      </w:r>
+      <w:r>
+        <w:t xml:space="preserve"> </w:t>
+      </w:r>
+      <w:r>
+        <w:lastRenderedPageBreak/>
+        <w:t>However, w</w:t>
+      </w:r>
+      <w:r>
+        <w:t xml:space="preserve">e were unable to find </w:t>
+      </w:r>
+      <w:r>
+        <w:t>the</w:t>
+      </w:r>
+      <w:r>
+        <w:t xml:space="preserve"> same</w:t>
+      </w:r>
+      <w:r>
+        <w:t xml:space="preserve"> effect of hunting season on a raven</w:t>
+      </w:r>
+      <w:r>
+        <w:t>’s</w:t>
+      </w:r>
+      <w:r>
+        <w:t xml:space="preserve"> probability of leaving their territories</w:t>
+      </w:r>
+      <w:r>
+        <w:t>.</w:t>
+      </w:r>
+      <w:r>
+        <w:t xml:space="preserve"> </w:t>
+      </w:r>
+      <w:r>
+        <w:t>This effect was likely masked by the limited time frame of the data, which failed to capture the initial increase in visits to the hunting area associated with the start of MTFWP rifle hunting, and alternative resources being present within our defined hunting regions.</w:t>
+      </w:r>
+      <w:r>
+        <w:t xml:space="preserve"> </w:t>
+      </w:r>
+      <w:r>
+        <w:t>Throughout</w:t>
+      </w:r>
+      <w:r>
+        <w:t xml:space="preserve"> the entire winter, raven </w:t>
+      </w:r>
+      <w:r>
+        <w:t>shifted their space use</w:t>
+      </w:r>
+      <w:r>
+        <w:t xml:space="preserve"> in the hunting regions</w:t>
+      </w:r>
+      <w:r>
+        <w:t xml:space="preserve"> consistent without the location of the primary available resource. During the hunting season,</w:t>
+      </w:r>
+      <w:r>
+        <w:t xml:space="preserve"> </w:t>
+      </w:r>
+      <w:r>
+        <w:t xml:space="preserve">ravens were less </w:t>
+      </w:r>
+      <w:r>
+        <w:t>concentrated</w:t>
+      </w:r>
+      <w:r>
+        <w:t xml:space="preserve"> around the landfill </w:t>
+      </w:r>
+      <w:r>
+        <w:t>indicat</w:t>
+      </w:r>
+      <w:r>
+        <w:t>ing</w:t>
+      </w:r>
+      <w:r>
+        <w:t xml:space="preserve"> that </w:t>
+      </w:r>
+      <w:r>
+        <w:t>refuse</w:t>
+      </w:r>
+      <w:r>
+        <w:t xml:space="preserve"> is</w:t>
+      </w:r>
+      <w:r>
+        <w:t xml:space="preserve"> lower priority than carrion.</w:t>
+      </w:r>
+      <w:r>
+        <w:t xml:space="preserve"> </w:t>
+      </w:r>
+      <w:r>
+        <w:t xml:space="preserve">Outside of the primary hunting seasons, ravens seeking alternative foraging opportunities often visited the Gardiner landfill and sewage treatment ponds. </w:t>
+      </w:r>
+      <w:r>
+        <w:t>Additionally,</w:t>
+      </w:r>
+      <w:r>
+        <w:t xml:space="preserve"> </w:t>
+      </w:r>
+      <w:r>
+        <w:t>ravens</w:t>
+      </w:r>
+      <w:r>
+        <w:t xml:space="preserve"> also </w:t>
+      </w:r>
+      <w:r>
+        <w:t>took</w:t>
+      </w:r>
+      <w:r>
+        <w:t xml:space="preserve"> advantage of low levels of tribal hunting </w:t>
+      </w:r>
+      <w:r>
+        <w:t>during mid-winter</w:t>
+      </w:r>
+      <w:r>
+        <w:t xml:space="preserve"> that occurs in a similar region to the MTFWP hunt. Tribal hunters, while having a more limited take compared to the MTFWP season </w:t>
+      </w:r>
+      <w:commentRangeStart w:id="24"/>
+      <w:r>
+        <w:t xml:space="preserve">(1-2 ungulates a week), </w:t>
+      </w:r>
+      <w:commentRangeEnd w:id="24"/>
       <w:r>
         <w:rPr>
           <w:rStyle w:val="CommentReference"/>
           <w:sz w:val="24"/>
           <w:szCs w:val="24"/>
         </w:rPr>
-        <w:commentReference w:id="23"/>
-      </w:r>
-      <w:r>
-        <w:t xml:space="preserve">, </w:t>
-      </w:r>
-      <w:r>
-        <w:t xml:space="preserve">we conclude that </w:t>
-      </w:r>
-      <w:r>
-        <w:t xml:space="preserve">ravens are preferentially choosing to visit anthropogenic resources such as recreational hunting areas. Subsequently, ravens leaving their territory are unlikely to be searching for wolf kills. </w:t>
-      </w:r>
-      <w:r>
-        <w:t>The presence of a newly located resource</w:t>
-      </w:r>
-      <w:r>
-        <w:t xml:space="preserve"> </w:t>
-      </w:r>
-      <w:r>
-        <w:t xml:space="preserve">during travel, such as a wolf kill, likely alters their plan but was not the intended destination. Previous studies mapping movements from </w:t>
-      </w:r>
-      <w:r>
-        <w:t xml:space="preserve">territorial </w:t>
-      </w:r>
-      <w:r>
-        <w:t xml:space="preserve">individuals in our study population showed direct commute paths with few deviation to pass through other areas in the northern range where wolf kills might be located </w:t>
-      </w:r>
-      <w:r>
-        <w:fldChar w:fldCharType="begin"/>
-      </w:r>
-      <w:r>
-        <w:instrText xml:space="preserve"> ADDIN ZOTERO_ITEM CSL_CITATION {"citationID":"O1r6Bykg","properties":{"unsorted":false,"formattedCitation":"(Marzluff et al. 2021)","plainCitation":"(Marzluff et al. 2021)","noteIndex":0},"citationItems":[{"id":972,"uris":["http://zotero.org/users/9968163/items/W246K25Z"],"itemData":{"id":972,"type":"article-journal","abstract":"Common ravens (Corvus corax; ravens) are generalist predators that pose a threat to several rare wildlife species in the western United States. Recent increases in raven populations, which are fueled by increased human subsidies—notably food, water, and nest sites—are concerning to those seeking to conserve rare species. Due to the challenges and inefficiencies of reducing or eliminating subsidies, managers increasingly rely on lethal removal of ravens. Over 125,000 ravens were killed by the U.S. Government from 1996 to 2019, and annual removals have increased 4-fold from the 1990s to mid-2010s. We contend that lethal removal of ravens, while capable of improving the reproduction of rare species, is at best a short-term and ethically untenable solution to a problem that will continue to grow until subsidies are meaningfully reduced or made inaccessible to ravens. In part because of ravens’ abilities to track natural and anthropogenic resources across unfamiliar and expansive areas, the removal of subsidies can lead to sustained shifts in raven abundance, which can have longlasting benefits for sensitive species. In the Greater Yellowstone Ecosystem, USA, for example, we documented extensive use of human subsidies during fall/winter, daily 1-way commutes regularly in excess of 50 km by territorial birds to such subsidies, and dispersals of &gt;700 km by nonbreeders that exploited food and roost subsidies. We call for managers to embrace new approaches to subsidy reduction including: increased involvement of conservation social scientists; increased enforcement of local, state, and federal laws; and increased deployment of a diversity of new technologies to haze and aversively condition ravens. Tackling the hard job of reducing subsidies over the expansive area exploited by ravens is right because it will increase the integrity, stability, and beauty of western ecosystems.","container-title":"Human-Wildlife Interaction","issue":"3","language":"en","page":"516-533","source":"Zotero","title":"Thinking Like a Raven: Restoring Integrity, Stability, and Beauty to Western Ecosystems","volume":"15","author":[{"family":"Marzluff","given":"John M"},{"family":"Loretto","given":"Matthias-Claudio"},{"family":"Ho","given":"Cameron K."},{"family":"Coleman","given":"Georgia W."},{"family":"Restani","given":"Marco"}],"issued":{"date-parts":[["2021"]]}}}],"schema":"https://github.com/citation-style-language/schema/raw/master/csl-citation.json"} </w:instrText>
-      </w:r>
-      <w:r>
-        <w:fldChar w:fldCharType="separate"/>
-      </w:r>
-      <w:r>
-        <w:rPr>
-          <w:rFonts w:ascii="Aptos" w:hAnsi="Aptos"/>
-        </w:rPr>
-        <w:t>(Marzluff et al. 2021)</w:t>
-      </w:r>
-      <w:r>
-        <w:fldChar w:fldCharType="end"/>
-      </w:r>
-      <w:r>
-        <w:t>. This sort of route planning between distant, known resources is</w:t>
-      </w:r>
-      <w:r>
-        <w:t xml:space="preserve"> used by baboons and elephants  </w:t>
-      </w:r>
-      <w:r>
-        <w:fldChar w:fldCharType="begin"/>
-      </w:r>
-      <w:r>
-        <w:instrText xml:space="preserve"> ADDIN ZOTERO_ITEM CSL_CITATION {"citationID":"dBWIEYH7","properties":{"formattedCitation":"(Noser and Byrne 2007, Polansky et al. 2015)","plainCitation":"(Noser and Byrne 2007, Polansky et al. 2015)","noteIndex":0},"citationItems":[{"id":1145,"uris":["http://zotero.org/users/9968163/items/JRVDYD5R"],"itemData":{"id":1145,"type":"article-journal","abstract":"The ability of animals to plan their foraging journeys and to approach resources in a goal-directed way may play a key role in cognitive evolution. Furthermore, optimal foraging theory assumes that animals are adapted to take least-effort routes between resources. Empirical evidence for these beliefs is largely lacking, however. We followed a group of chacma baboons over full days during a 16-month field study. We used GPS to investigate route linearity, travel speed and inter-resource distances, and the degree to which movement was guided by direct visual stimuli from the resources. During the dry season the study group travelled rapidly to sparse fruit sources and waterholes along linear paths over large distances. Inter-resource distances were larger than distances from which the resources could be seen. Seed resources, although situated closer to the sleeping site than fruit sources, were bypassed in the mornings and consumed predominantly in the afternoons, when movements were less linear, slower and shorter. During the rainy season, the animals left their sleeping sites earlier when visiting restricted and patchily distributed fig trees than when visiting abundant and evenly distributed fruit resources. However, travel speed and route linearity were not always associated with goal directedness, because the baboons approached the single sleeping site, presumably a vital resource, slowly and indirectly. Our results suggest that baboons plan their journeys, actively choosing between several out-of-sight resources and approaching them in an efficient, goal-directed way, characteristics commonly used as diagnostic for the presence of a cognitive map and episodic memory.","container-title":"Animal Behaviour","DOI":"10.1016/j.anbehav.2006.04.012","ISSN":"0003-3472","issue":"2","journalAbbreviation":"Animal Behaviour","page":"257-266","source":"ScienceDirect","title":"Travel routes and planning of visits to out-of-sight resources in wild chacma baboons, &lt;i&gt;Papio ursinus&lt;/i&gt;","volume":"73","author":[{"family":"Noser","given":"Rahel"},{"family":"Byrne","given":"Richard W."}],"issued":{"date-parts":[["2007",2,1]]}}},{"id":1147,"uris":["http://zotero.org/users/9968163/items/DGHD5DI8"],"itemData":{"id":1147,"type":"article-journal","abstract":"Spatial memory facilitates resource acquisition where resources are patchy, but how it influences movement behaviour of wide-ranging species remains to be resolved. We examined African elephant spatial memory reflected in movement decisions regarding access to perennial waterholes. State–space models of movement data revealed a rapid, highly directional movement behaviour almost exclusively associated with visiting perennial water. Behavioural change point (BCP) analyses demonstrated that these goal-oriented movements were initiated on average 4.59 km, and up to 49.97 km, from the visited waterhole, with the closest waterhole accessed 90% of the time. Distances of decision points increased when switching to different waterholes, during the dry season, or for female groups relative to males, while selection of the closest waterhole decreased when switching. Overall, our analyses indicated detailed spatial knowledge over large scales, enabling elephants to minimize travel distance through highly directional movement when accessing water. We discuss the likely cognitive and socioecological mechanisms driving these spatially precise movements that are most consistent with our findings. By applying modern analytic techniques to high-resolution movement data, this study illustrates emerging approaches for studying how cognition structures animal movement behaviour in different ecological and social contexts.","container-title":"Proceedings of the Royal Society B: Biological Sciences","DOI":"10.1098/rspb.2014.3042","ISSN":"0962-8452","issue":"1805","journalAbbreviation":"Proc Biol Sci","page":"20143042","source":"Silverchair","title":"Elucidating the significance of spatial memory on movement decisions by African savannah elephants using state–space models","volume":"282","author":[{"family":"Polansky","given":"Leo"},{"family":"Kilian","given":"Werner"},{"family":"Wittemyer","given":"George"}],"issued":{"date-parts":[["2015",4,22]]}}}],"schema":"https://github.com/citation-style-language/schema/raw/master/csl-citation.json"} </w:instrText>
-      </w:r>
-      <w:r>
-        <w:fldChar w:fldCharType="separate"/>
-      </w:r>
-      <w:r>
-        <w:t>(Noser and Byrne 2007, Polansky et al. 2015)</w:t>
-      </w:r>
-      <w:r>
-        <w:fldChar w:fldCharType="end"/>
-      </w:r>
-      <w:r>
-        <w:t xml:space="preserve"> and is</w:t>
-      </w:r>
-      <w:r>
-        <w:t xml:space="preserve"> likely performed by ravens </w:t>
-      </w:r>
-      <w:r>
-        <w:fldChar w:fldCharType="begin"/>
-      </w:r>
-      <w:r>
-        <w:instrText xml:space="preserve"> ADDIN ZOTERO_ITEM CSL_CITATION {"citationID":"r9fRoC6R","properties":{"unsorted":false,"formattedCitation":"(Loretto et al. 2026)","plainCitation":"(Loretto et al. 2026)","noteIndex":0},"citationItems":[{"id":1582,"uris":["http://zotero.org/users/9968163/items/BAM3LF88"],"itemData":{"id":1582,"type":"article-journal","abstract":"Scavengers generally rely on patchily distributed, unpredictable carrion. A long-standing hypothesis suggests scavenging ravens reliably locate such food by directly following large carnivores to their kills. However, by satellite tracking 69 ravens, 20 wolves, and 11 cougars in Yellowstone National Park, we found that following of predators over large distances rarely occurred. Instead, ravens routinely revisited sites where wolf kills were common—returning from distances of up to 155 kilometers to find carrion. Much like navigating to permanent anthropogenic subsidies, ravens appear to remember potential sources of carrion shaped by previous encounters with wolves or their kills. These findings suggest that spatial memory and navigation play a considerably greater role than previously assumed among scavengers, and possibly other wide-ranging species, in search of ephemeral resources.","container-title":"Science","DOI":"10.1126/science.adz9467","issue":"6790","page":"1151-1154","publisher":"American Association for the Advancement of Science","source":"science.org (Atypon)","title":"Ravens anticipate wolf kill sites across broad scales","volume":"391","author":[{"family":"Loretto","given":"Matthias-Claudio"},{"family":"Beck","given":"Kristina B."},{"family":"Smith","given":"Douglas W."},{"family":"Stahler","given":"Daniel R."},{"family":"Walker","given":"Lauren E."},{"family":"Wikelski","given":"Martin"},{"family":"Mueller","given":"Thomas"},{"family":"Safi","given":"Kamran"},{"family":"Marzluff","given":"John M."}],"issued":{"date-parts":[["2026",3,12]]}}}],"schema":"https://github.com/citation-style-language/schema/raw/master/csl-citation.json"} </w:instrText>
-      </w:r>
-      <w:r>
-        <w:fldChar w:fldCharType="separate"/>
-      </w:r>
-      <w:r>
-        <w:rPr>
-          <w:rFonts w:ascii="Aptos" w:hAnsi="Aptos"/>
-        </w:rPr>
-        <w:t>(Loretto et al. 2026)</w:t>
-      </w:r>
-      <w:r>
-        <w:fldChar w:fldCharType="end"/>
-      </w:r>
-      <w:r>
-        <w:t>. Route planning to known resources allows overall energetic costs to be predictable</w:t>
-      </w:r>
-      <w:r>
-        <w:t xml:space="preserve">. </w:t>
-      </w:r>
-    </w:p>
-    <w:p>
-      <w:pPr>
-        <w:spacing w:line="480" w:lineRule="auto"/>
-        <w:ind w:firstLine="720"/>
-      </w:pPr>
-      <w:r>
-        <w:t>After leaving their territories, ravens were more likely to visit the hunting regions during the hunting season, regardless of the amount of biomass created by hunters.</w:t>
-      </w:r>
-      <w:r>
-        <w:t xml:space="preserve"> </w:t>
-      </w:r>
-      <w:r>
-        <w:t>However, w</w:t>
-      </w:r>
-      <w:r>
-        <w:t xml:space="preserve">e were unable to find </w:t>
-      </w:r>
-      <w:r>
-        <w:t>the</w:t>
-      </w:r>
-      <w:r>
-        <w:t xml:space="preserve"> same</w:t>
-      </w:r>
-      <w:r>
-        <w:t xml:space="preserve"> effect of hunting season on a raven</w:t>
-      </w:r>
-      <w:r>
-        <w:t>’s</w:t>
-      </w:r>
-      <w:r>
-        <w:t xml:space="preserve"> probability </w:t>
-      </w:r>
-      <w:r>
-        <w:lastRenderedPageBreak/>
-        <w:t>of leaving their territories</w:t>
-      </w:r>
-      <w:r>
-        <w:t>.</w:t>
-      </w:r>
-      <w:r>
-        <w:t xml:space="preserve"> </w:t>
-      </w:r>
-      <w:r>
-        <w:t>This effect was likely masked by the limited time frame of the data, which failed to capture the initial increase in visits to the hunting area associated with the start of MTFWP rifle hunting, and alternative resources being present within our defined hunting regions.</w:t>
-      </w:r>
-      <w:r>
-        <w:t xml:space="preserve"> </w:t>
-      </w:r>
-      <w:r>
-        <w:t>Throughout</w:t>
-      </w:r>
-      <w:r>
-        <w:t xml:space="preserve"> the entire winter, raven </w:t>
-      </w:r>
-      <w:r>
-        <w:t>shifted their space use</w:t>
-      </w:r>
-      <w:r>
-        <w:t xml:space="preserve"> in the hunting regions</w:t>
-      </w:r>
-      <w:r>
-        <w:t xml:space="preserve"> consistent without the location of the primary available resource. During the hunting season,</w:t>
-      </w:r>
-      <w:r>
-        <w:t xml:space="preserve"> </w:t>
-      </w:r>
-      <w:r>
-        <w:t xml:space="preserve">ravens were less </w:t>
-      </w:r>
-      <w:r>
-        <w:t>concentrated</w:t>
-      </w:r>
-      <w:r>
-        <w:t xml:space="preserve"> around the landfill </w:t>
-      </w:r>
-      <w:r>
-        <w:t>indicat</w:t>
-      </w:r>
-      <w:r>
-        <w:t>ing</w:t>
-      </w:r>
-      <w:r>
-        <w:t xml:space="preserve"> that </w:t>
-      </w:r>
-      <w:r>
-        <w:t>refuse</w:t>
-      </w:r>
-      <w:r>
-        <w:t xml:space="preserve"> is</w:t>
-      </w:r>
-      <w:r>
-        <w:t xml:space="preserve"> lower priority than carrion.</w:t>
-      </w:r>
-      <w:r>
-        <w:t xml:space="preserve"> </w:t>
-      </w:r>
-      <w:r>
-        <w:t xml:space="preserve">Outside of the primary hunting seasons, ravens seeking alternative foraging opportunities often visited the Gardiner landfill and sewage treatment ponds. </w:t>
-      </w:r>
-      <w:r>
-        <w:t>Additionally,</w:t>
-      </w:r>
-      <w:r>
-        <w:t xml:space="preserve"> </w:t>
-      </w:r>
-      <w:r>
-        <w:t>ravens</w:t>
-      </w:r>
-      <w:r>
-        <w:t xml:space="preserve"> also </w:t>
-      </w:r>
-      <w:r>
-        <w:t>took</w:t>
-      </w:r>
-      <w:r>
-        <w:t xml:space="preserve"> advantage of low levels of tribal hunting </w:t>
-      </w:r>
-      <w:r>
-        <w:t>during mid-winter</w:t>
-      </w:r>
-      <w:r>
-        <w:t xml:space="preserve"> that occurs in a similar region to the MTFWP hunt. Tribal hunters, while having a more limited take compared to the MTFWP season </w:t>
-      </w:r>
-      <w:commentRangeStart w:id="24"/>
-      <w:r>
-        <w:t xml:space="preserve">(1-2 ungulates a week), </w:t>
-      </w:r>
-      <w:commentRangeEnd w:id="24"/>
+        <w:commentReference w:id="24"/>
+      </w:r>
+      <w:r>
+        <w:t xml:space="preserve">still create carrion throughout the central winter months that can draw large </w:t>
+      </w:r>
+      <w:commentRangeStart w:id="25"/>
+      <w:r>
+        <w:t>groups of ravens</w:t>
+      </w:r>
+      <w:commentRangeEnd w:id="25"/>
       <w:r>
         <w:rPr>
           <w:rStyle w:val="CommentReference"/>
           <w:sz w:val="24"/>
           <w:szCs w:val="24"/>
         </w:rPr>
-        <w:commentReference w:id="24"/>
-      </w:r>
-      <w:r>
-        <w:t xml:space="preserve">still create carrion throughout the central winter months that can draw large </w:t>
-      </w:r>
-      <w:commentRangeStart w:id="25"/>
-      <w:r>
-        <w:t>groups of ravens</w:t>
-      </w:r>
-      <w:commentRangeEnd w:id="25"/>
-      <w:r>
-        <w:rPr>
-          <w:rStyle w:val="CommentReference"/>
-          <w:sz w:val="24"/>
-          <w:szCs w:val="24"/>
-        </w:rPr>
         <w:commentReference w:id="25"/>
       </w:r>
       <w:r>
@@ -4684,7 +4817,11 @@
         <w:t xml:space="preserve"> </w:t>
       </w:r>
       <w:r>
-        <w:t>These occasional trips allow them to update</w:t>
+        <w:t xml:space="preserve">These occasional trips allow </w:t>
+      </w:r>
+      <w:r>
+        <w:lastRenderedPageBreak/>
+        <w:t>them to update</w:t>
       </w:r>
       <w:r>
         <w:t xml:space="preserve"> their knowledge about the foraging conditions of</w:t>
@@ -4711,14 +4848,7 @@
         <w:rPr>
           <w:rFonts w:ascii="Aptos" w:hAnsi="Aptos"/>
         </w:rPr>
-        <w:t xml:space="preserve">(Smith and </w:t>
-      </w:r>
-      <w:r>
-        <w:rPr>
-          <w:rFonts w:ascii="Aptos" w:hAnsi="Aptos"/>
-        </w:rPr>
-        <w:lastRenderedPageBreak/>
-        <w:t>Sweatman 1974)</w:t>
+        <w:t>(Smith and Sweatman 1974)</w:t>
       </w:r>
       <w:r>
         <w:fldChar w:fldCharType="end"/>
@@ -5828,7 +5958,7 @@
       </w:r>
     </w:p>
   </w:comment>
-  <w:comment w:id="18" w:author="Cameron Ho" w:date="2026-04-06T17:43:00Z" w:initials="CH">
+  <w:comment w:id="18" w:author="Cameron Ho" w:date="2026-02-10T18:08:00Z" w:initials="CH">
     <w:p>
       <w:pPr>
         <w:pStyle w:val="CommentText"/>
@@ -5840,11 +5970,27 @@
         <w:annotationRef/>
       </w:r>
       <w:r>
+        <w:t>although there are days not calculated into this stat that were removed for too few GPS points or just didn’t have any GPS points.</w:t>
+      </w:r>
+    </w:p>
+  </w:comment>
+  <w:comment w:id="19" w:author="Cameron Ho" w:date="2026-04-06T17:43:00Z" w:initials="CH">
+    <w:p>
+      <w:pPr>
+        <w:pStyle w:val="CommentText"/>
+      </w:pPr>
+      <w:r>
+        <w:rPr>
+          <w:rStyle w:val="CommentReference"/>
+        </w:rPr>
+        <w:annotationRef/>
+      </w:r>
+      <w:r>
         <w:t>Any suggestions on how to improve calrity of wolf kill portion. Active kill means on territory. Visit kill means off territory. I say that in the caption, but its not a clear distinction in the graphic</w:t>
       </w:r>
     </w:p>
   </w:comment>
-  <w:comment w:id="19" w:author="Cameron Ho" w:date="2026-01-31T14:57:00Z" w:initials="CH">
+  <w:comment w:id="20" w:author="Cameron Ho" w:date="2026-01-31T14:57:00Z" w:initials="CH">
     <w:p>
       <w:pPr>
         <w:pStyle w:val="CommentText"/>
@@ -5860,7 +6006,7 @@
       </w:r>
     </w:p>
   </w:comment>
-  <w:comment w:id="20" w:author="Cameron Ho" w:date="2026-04-09T17:05:00Z" w:initials="CH">
+  <w:comment w:id="21" w:author="Cameron Ho" w:date="2026-04-09T17:05:00Z" w:initials="CH">
     <w:p>
       <w:pPr>
         <w:pStyle w:val="CommentText"/>
@@ -5876,7 +6022,7 @@
       </w:r>
     </w:p>
   </w:comment>
-  <w:comment w:id="21" w:author="Cameron Ho" w:date="2026-04-07T17:06:00Z" w:initials="CH">
+  <w:comment w:id="22" w:author="Cameron Ho" w:date="2026-04-07T17:06:00Z" w:initials="CH">
     <w:p>
       <w:pPr>
         <w:pStyle w:val="CommentText"/>
@@ -5921,7 +6067,7 @@
       </w:r>
     </w:p>
   </w:comment>
-  <w:comment w:id="22" w:author="Cameron Ho" w:date="2026-02-09T16:56:00Z" w:initials="CH">
+  <w:comment w:id="23" w:author="Cameron Ho" w:date="2026-02-09T16:56:00Z" w:initials="CH">
     <w:p>
       <w:pPr>
         <w:pStyle w:val="CommentText"/>
@@ -5991,22 +6137,6 @@
       </w:pPr>
       <w:r>
         <w:t>Only competes for immediate space around the carcass to feed</w:t>
-      </w:r>
-    </w:p>
-  </w:comment>
-  <w:comment w:id="23" w:author="Cameron Ho" w:date="2026-04-14T12:29:00Z" w:initials="CH">
-    <w:p>
-      <w:pPr>
-        <w:pStyle w:val="CommentText"/>
-      </w:pPr>
-      <w:r>
-        <w:rPr>
-          <w:rStyle w:val="CommentReference"/>
-        </w:rPr>
-        <w:annotationRef/>
-      </w:r>
-      <w:r>
-        <w:t>And knowledge</w:t>
       </w:r>
     </w:p>
   </w:comment>
@@ -6142,12 +6272,12 @@
   <w15:commentEx w15:paraId="6915C913" w15:done="0"/>
   <w15:commentEx w15:paraId="26036C4C" w15:paraIdParent="6915C913" w15:done="0"/>
   <w15:commentEx w15:paraId="48A62A57" w15:done="0"/>
+  <w15:commentEx w15:paraId="15929AA2" w15:done="0"/>
   <w15:commentEx w15:paraId="6B5A0ECA" w15:done="0"/>
   <w15:commentEx w15:paraId="2AFD599F" w15:done="0"/>
   <w15:commentEx w15:paraId="17C17B47" w15:done="0"/>
   <w15:commentEx w15:paraId="1F9FF958" w15:done="0"/>
   <w15:commentEx w15:paraId="6471B4C4" w15:done="1"/>
-  <w15:commentEx w15:paraId="15621E25" w15:done="0"/>
   <w15:commentEx w15:paraId="2E811A34" w15:done="0"/>
   <w15:commentEx w15:paraId="29D70C64" w15:done="0"/>
   <w15:commentEx w15:paraId="193CECBE" w15:done="0"/>
@@ -6177,12 +6307,12 @@
   <w16cex:commentExtensible w16cex:durableId="791C2025" w16cex:dateUtc="2026-04-14T17:49:00Z"/>
   <w16cex:commentExtensible w16cex:durableId="50117B5D" w16cex:dateUtc="2026-04-14T23:24:00Z"/>
   <w16cex:commentExtensible w16cex:durableId="0D56E04E" w16cex:dateUtc="2026-04-02T21:21:00Z"/>
+  <w16cex:commentExtensible w16cex:durableId="62D4365B" w16cex:dateUtc="2026-02-11T02:08:00Z"/>
   <w16cex:commentExtensible w16cex:durableId="08F6AC28" w16cex:dateUtc="2026-04-07T00:43:00Z"/>
   <w16cex:commentExtensible w16cex:durableId="333CE58C" w16cex:dateUtc="2026-01-31T22:57:00Z"/>
   <w16cex:commentExtensible w16cex:durableId="542E17E6" w16cex:dateUtc="2026-04-10T00:05:00Z"/>
   <w16cex:commentExtensible w16cex:durableId="3F758BA4" w16cex:dateUtc="2026-04-08T00:06:00Z"/>
   <w16cex:commentExtensible w16cex:durableId="08517F74" w16cex:dateUtc="2026-02-10T00:56:00Z"/>
-  <w16cex:commentExtensible w16cex:durableId="46CC3155" w16cex:dateUtc="2026-04-14T19:29:00Z"/>
   <w16cex:commentExtensible w16cex:durableId="14036126" w16cex:dateUtc="2026-04-02T23:49:00Z"/>
   <w16cex:commentExtensible w16cex:durableId="67EC819E" w16cex:dateUtc="2026-04-02T22:48:00Z"/>
   <w16cex:commentExtensible w16cex:durableId="658D8037" w16cex:dateUtc="2026-04-14T23:54:00Z"/>
@@ -6212,12 +6342,12 @@
   <w16cid:commentId w16cid:paraId="6915C913" w16cid:durableId="791C2025"/>
   <w16cid:commentId w16cid:paraId="26036C4C" w16cid:durableId="50117B5D"/>
   <w16cid:commentId w16cid:paraId="48A62A57" w16cid:durableId="0D56E04E"/>
+  <w16cid:commentId w16cid:paraId="15929AA2" w16cid:durableId="62D4365B"/>
   <w16cid:commentId w16cid:paraId="6B5A0ECA" w16cid:durableId="08F6AC28"/>
   <w16cid:commentId w16cid:paraId="2AFD599F" w16cid:durableId="333CE58C"/>
   <w16cid:commentId w16cid:paraId="17C17B47" w16cid:durableId="542E17E6"/>
   <w16cid:commentId w16cid:paraId="1F9FF958" w16cid:durableId="3F758BA4"/>
   <w16cid:commentId w16cid:paraId="6471B4C4" w16cid:durableId="08517F74"/>
-  <w16cid:commentId w16cid:paraId="15621E25" w16cid:durableId="46CC3155"/>
   <w16cid:commentId w16cid:paraId="2E811A34" w16cid:durableId="14036126"/>
   <w16cid:commentId w16cid:paraId="29D70C64" w16cid:durableId="67EC819E"/>
   <w16cid:commentId w16cid:paraId="193CECBE" w16cid:durableId="658D8037"/>
@@ -6889,6 +7019,7 @@
   <w:style w:type="character" w:default="1" w:styleId="DefaultParagraphFont">
     <w:name w:val="Default Paragraph Font"/>
     <w:uiPriority w:val="1"/>
+    <w:semiHidden/>
     <w:unhideWhenUsed/>
   </w:style>
   <w:style w:type="table" w:default="1" w:styleId="TableNormal">

</xml_diff>